<commit_message>
Aktueller Stand: UI aktualisiert, Variablenliste robust, Tabellenoptionen stabil
</commit_message>
<xml_diff>
--- a/TEST ORDNER/Word add-in cbe4f1c1-6a07-46b7-8453-ffc1395413c3.docx
+++ b/TEST ORDNER/Word add-in cbe4f1c1-6a07-46b7-8453-ffc1395413c3.docx
@@ -599,47 +599,447 @@
       </w:r>
     </w:p>
     <w:p>
-      <w:pPr>
-        <w:rPr>
-          <w:highlight w:val="yellow"/>
-        </w:rPr>
-      </w:pPr>
-      <w:proofErr w:type="spellStart"/>
-      <w:r>
-        <w:t>kkkkkkkk</w:t>
+      <w:proofErr w:type="spellStart"/>
+      <w:r>
+        <w:t>K</w:t>
+      </w:r>
+      <w:r>
+        <w:t>kkkkkkk</w:t>
       </w:r>
       <w:proofErr w:type="spellEnd"/>
     </w:p>
-    <w:p>
-      <w:pPr>
-        <w:rPr>
-          <w:highlight w:val="yellow"/>
-        </w:rPr>
-      </w:pPr>
-    </w:p>
+    <w:p/>
     <w:sdt>
       <w:sdtPr>
-        <w:rPr>
-          <w:highlight w:val="yellow"/>
-        </w:rPr>
         <w:alias w:val="Excel-Variable: Tab2ddd"/>
-        <w:tag w:val="excelvar|Tab2ddd|table|0|1|0|1"/>
-        <w:id w:val="650411536"/>
+        <w:tag w:val="excelvar|Tab2ddd|table|1|0|1|0"/>
+        <w:id w:val="-1673558705"/>
         <w:placeholder>
-          <w:docPart w:val="7E95AFE77384054ABF1F1BC7F3FCB308"/>
+          <w:docPart w:val="94DB373E7B66344B8F71333A221AE188"/>
         </w:placeholder>
       </w:sdtPr>
       <w:sdtContent>
-        <w:p>
-          <w:pPr>
-            <w:rPr>
-              <w:highlight w:val="yellow"/>
-            </w:rPr>
-          </w:pPr>
-        </w:p>
+        <w:p/>
         <w:tbl>
           <w:tblPr>
-            <w:tblW w:w="0" w:type="dxa"/>
+            <w:tblW w:w="4621" w:type="pct"/>
+            <w:tblCellMar>
+              <w:top w:w="15" w:type="dxa"/>
+              <w:left w:w="15" w:type="dxa"/>
+              <w:bottom w:w="15" w:type="dxa"/>
+              <w:right w:w="15" w:type="dxa"/>
+            </w:tblCellMar>
+            <w:tblLook w:val="04A0" w:firstRow="1" w:lastRow="0" w:firstColumn="1" w:lastColumn="0" w:noHBand="0" w:noVBand="1"/>
+          </w:tblPr>
+          <w:tblGrid>
+            <w:gridCol w:w="1418"/>
+            <w:gridCol w:w="4492"/>
+            <w:gridCol w:w="2741"/>
+          </w:tblGrid>
+          <w:tr>
+            <w:tc>
+              <w:tcPr>
+                <w:tcW w:w="820" w:type="pct"/>
+                <w:tcBorders>
+                  <w:top w:val="nil"/>
+                  <w:left w:val="nil"/>
+                  <w:bottom w:val="nil"/>
+                  <w:right w:val="nil"/>
+                </w:tcBorders>
+                <w:tcMar>
+                  <w:top w:w="90" w:type="dxa"/>
+                  <w:left w:w="120" w:type="dxa"/>
+                  <w:bottom w:w="90" w:type="dxa"/>
+                  <w:right w:w="120" w:type="dxa"/>
+                </w:tcMar>
+                <w:hideMark/>
+              </w:tcPr>
+              <w:p>
+                <w:pPr>
+                  <w:rPr>
+                    <w:rFonts w:eastAsia="Times New Roman"/>
+                    <w:sz w:val="24"/>
+                    <w:szCs w:val="24"/>
+                  </w:rPr>
+                </w:pPr>
+                <w:proofErr w:type="spellStart"/>
+                <w:r>
+                  <w:rPr>
+                    <w:rFonts w:eastAsia="Times New Roman"/>
+                  </w:rPr>
+                  <w:t>qqqq</w:t>
+                </w:r>
+                <w:proofErr w:type="spellEnd"/>
+              </w:p>
+            </w:tc>
+            <w:tc>
+              <w:tcPr>
+                <w:tcW w:w="2596" w:type="pct"/>
+                <w:tcBorders>
+                  <w:top w:val="nil"/>
+                  <w:left w:val="nil"/>
+                  <w:bottom w:val="nil"/>
+                  <w:right w:val="nil"/>
+                </w:tcBorders>
+                <w:tcMar>
+                  <w:top w:w="90" w:type="dxa"/>
+                  <w:left w:w="120" w:type="dxa"/>
+                  <w:bottom w:w="90" w:type="dxa"/>
+                  <w:right w:w="120" w:type="dxa"/>
+                </w:tcMar>
+                <w:hideMark/>
+              </w:tcPr>
+              <w:p>
+                <w:pPr>
+                  <w:rPr>
+                    <w:rFonts w:eastAsia="Times New Roman"/>
+                  </w:rPr>
+                </w:pPr>
+                <w:proofErr w:type="spellStart"/>
+                <w:r>
+                  <w:rPr>
+                    <w:rFonts w:eastAsia="Times New Roman"/>
+                  </w:rPr>
+                  <w:t>eee</w:t>
+                </w:r>
+                <w:proofErr w:type="spellEnd"/>
+              </w:p>
+            </w:tc>
+            <w:tc>
+              <w:tcPr>
+                <w:tcW w:w="0" w:type="auto"/>
+                <w:tcBorders>
+                  <w:top w:val="nil"/>
+                  <w:left w:val="nil"/>
+                  <w:bottom w:val="nil"/>
+                  <w:right w:val="nil"/>
+                </w:tcBorders>
+                <w:tcMar>
+                  <w:top w:w="90" w:type="dxa"/>
+                  <w:left w:w="120" w:type="dxa"/>
+                  <w:bottom w:w="90" w:type="dxa"/>
+                  <w:right w:w="120" w:type="dxa"/>
+                </w:tcMar>
+                <w:hideMark/>
+              </w:tcPr>
+              <w:p>
+                <w:pPr>
+                  <w:rPr>
+                    <w:rFonts w:eastAsia="Times New Roman"/>
+                  </w:rPr>
+                </w:pPr>
+                <w:r>
+                  <w:rPr>
+                    <w:rFonts w:eastAsia="Times New Roman"/>
+                  </w:rPr>
+                  <w:t>888</w:t>
+                </w:r>
+              </w:p>
+            </w:tc>
+          </w:tr>
+          <w:tr>
+            <w:tc>
+              <w:tcPr>
+                <w:tcW w:w="820" w:type="pct"/>
+                <w:tcBorders>
+                  <w:top w:val="nil"/>
+                  <w:left w:val="nil"/>
+                  <w:bottom w:val="nil"/>
+                  <w:right w:val="nil"/>
+                </w:tcBorders>
+                <w:tcMar>
+                  <w:top w:w="90" w:type="dxa"/>
+                  <w:left w:w="120" w:type="dxa"/>
+                  <w:bottom w:w="90" w:type="dxa"/>
+                  <w:right w:w="120" w:type="dxa"/>
+                </w:tcMar>
+                <w:hideMark/>
+              </w:tcPr>
+              <w:p>
+                <w:pPr>
+                  <w:rPr>
+                    <w:rFonts w:eastAsia="Times New Roman"/>
+                  </w:rPr>
+                </w:pPr>
+                <w:r>
+                  <w:rPr>
+                    <w:rFonts w:eastAsia="Times New Roman"/>
+                  </w:rPr>
+                  <w:t>999</w:t>
+                </w:r>
+              </w:p>
+            </w:tc>
+            <w:tc>
+              <w:tcPr>
+                <w:tcW w:w="2596" w:type="pct"/>
+                <w:tcBorders>
+                  <w:top w:val="nil"/>
+                  <w:left w:val="nil"/>
+                  <w:bottom w:val="nil"/>
+                  <w:right w:val="nil"/>
+                </w:tcBorders>
+                <w:tcMar>
+                  <w:top w:w="90" w:type="dxa"/>
+                  <w:left w:w="120" w:type="dxa"/>
+                  <w:bottom w:w="90" w:type="dxa"/>
+                  <w:right w:w="120" w:type="dxa"/>
+                </w:tcMar>
+                <w:hideMark/>
+              </w:tcPr>
+              <w:p>
+                <w:pPr>
+                  <w:rPr>
+                    <w:rFonts w:eastAsia="Times New Roman"/>
+                  </w:rPr>
+                </w:pPr>
+                <w:r>
+                  <w:rPr>
+                    <w:rFonts w:eastAsia="Times New Roman"/>
+                  </w:rPr>
+                  <w:t>999</w:t>
+                </w:r>
+              </w:p>
+            </w:tc>
+            <w:tc>
+              <w:tcPr>
+                <w:tcW w:w="0" w:type="auto"/>
+                <w:tcBorders>
+                  <w:top w:val="nil"/>
+                  <w:left w:val="nil"/>
+                  <w:bottom w:val="nil"/>
+                  <w:right w:val="nil"/>
+                </w:tcBorders>
+                <w:tcMar>
+                  <w:top w:w="90" w:type="dxa"/>
+                  <w:left w:w="120" w:type="dxa"/>
+                  <w:bottom w:w="90" w:type="dxa"/>
+                  <w:right w:w="120" w:type="dxa"/>
+                </w:tcMar>
+                <w:hideMark/>
+              </w:tcPr>
+              <w:p>
+                <w:pPr>
+                  <w:rPr>
+                    <w:rFonts w:eastAsia="Times New Roman"/>
+                  </w:rPr>
+                </w:pPr>
+                <w:r>
+                  <w:rPr>
+                    <w:rFonts w:eastAsia="Times New Roman"/>
+                  </w:rPr>
+                  <w:t>99</w:t>
+                </w:r>
+              </w:p>
+            </w:tc>
+          </w:tr>
+          <w:tr>
+            <w:tc>
+              <w:tcPr>
+                <w:tcW w:w="820" w:type="pct"/>
+                <w:tcBorders>
+                  <w:top w:val="nil"/>
+                  <w:left w:val="nil"/>
+                  <w:bottom w:val="nil"/>
+                  <w:right w:val="nil"/>
+                </w:tcBorders>
+                <w:tcMar>
+                  <w:top w:w="90" w:type="dxa"/>
+                  <w:left w:w="120" w:type="dxa"/>
+                  <w:bottom w:w="90" w:type="dxa"/>
+                  <w:right w:w="120" w:type="dxa"/>
+                </w:tcMar>
+                <w:hideMark/>
+              </w:tcPr>
+              <w:p>
+                <w:pPr>
+                  <w:rPr>
+                    <w:rFonts w:eastAsia="Times New Roman"/>
+                  </w:rPr>
+                </w:pPr>
+                <w:r>
+                  <w:rPr>
+                    <w:rFonts w:eastAsia="Times New Roman"/>
+                  </w:rPr>
+                  <w:t>555</w:t>
+                </w:r>
+              </w:p>
+            </w:tc>
+            <w:tc>
+              <w:tcPr>
+                <w:tcW w:w="2596" w:type="pct"/>
+                <w:tcBorders>
+                  <w:top w:val="nil"/>
+                  <w:left w:val="nil"/>
+                  <w:bottom w:val="nil"/>
+                  <w:right w:val="nil"/>
+                </w:tcBorders>
+                <w:tcMar>
+                  <w:top w:w="90" w:type="dxa"/>
+                  <w:left w:w="120" w:type="dxa"/>
+                  <w:bottom w:w="90" w:type="dxa"/>
+                  <w:right w:w="120" w:type="dxa"/>
+                </w:tcMar>
+                <w:hideMark/>
+              </w:tcPr>
+              <w:p>
+                <w:pPr>
+                  <w:rPr>
+                    <w:rFonts w:eastAsia="Times New Roman"/>
+                  </w:rPr>
+                </w:pPr>
+                <w:r>
+                  <w:rPr>
+                    <w:rFonts w:eastAsia="Times New Roman"/>
+                  </w:rPr>
+                  <w:t>55</w:t>
+                </w:r>
+              </w:p>
+            </w:tc>
+            <w:tc>
+              <w:tcPr>
+                <w:tcW w:w="0" w:type="auto"/>
+                <w:tcBorders>
+                  <w:top w:val="nil"/>
+                  <w:left w:val="nil"/>
+                  <w:bottom w:val="nil"/>
+                  <w:right w:val="nil"/>
+                </w:tcBorders>
+                <w:tcMar>
+                  <w:top w:w="90" w:type="dxa"/>
+                  <w:left w:w="120" w:type="dxa"/>
+                  <w:bottom w:w="90" w:type="dxa"/>
+                  <w:right w:w="120" w:type="dxa"/>
+                </w:tcMar>
+                <w:hideMark/>
+              </w:tcPr>
+              <w:p>
+                <w:pPr>
+                  <w:rPr>
+                    <w:rFonts w:eastAsia="Times New Roman"/>
+                  </w:rPr>
+                </w:pPr>
+                <w:r>
+                  <w:rPr>
+                    <w:rFonts w:eastAsia="Times New Roman"/>
+                  </w:rPr>
+                  <w:t>66</w:t>
+                </w:r>
+              </w:p>
+            </w:tc>
+          </w:tr>
+          <w:tr>
+            <w:tc>
+              <w:tcPr>
+                <w:tcW w:w="820" w:type="pct"/>
+                <w:tcBorders>
+                  <w:top w:val="nil"/>
+                  <w:left w:val="nil"/>
+                  <w:bottom w:val="nil"/>
+                  <w:right w:val="nil"/>
+                </w:tcBorders>
+                <w:tcMar>
+                  <w:top w:w="90" w:type="dxa"/>
+                  <w:left w:w="120" w:type="dxa"/>
+                  <w:bottom w:w="90" w:type="dxa"/>
+                  <w:right w:w="120" w:type="dxa"/>
+                </w:tcMar>
+                <w:hideMark/>
+              </w:tcPr>
+              <w:p>
+                <w:pPr>
+                  <w:rPr>
+                    <w:rFonts w:eastAsia="Times New Roman"/>
+                  </w:rPr>
+                </w:pPr>
+                <w:r>
+                  <w:rPr>
+                    <w:rFonts w:eastAsia="Times New Roman"/>
+                  </w:rPr>
+                  <w:t>1554</w:t>
+                </w:r>
+              </w:p>
+            </w:tc>
+            <w:tc>
+              <w:tcPr>
+                <w:tcW w:w="2596" w:type="pct"/>
+                <w:tcBorders>
+                  <w:top w:val="nil"/>
+                  <w:left w:val="nil"/>
+                  <w:bottom w:val="nil"/>
+                  <w:right w:val="nil"/>
+                </w:tcBorders>
+                <w:tcMar>
+                  <w:top w:w="90" w:type="dxa"/>
+                  <w:left w:w="120" w:type="dxa"/>
+                  <w:bottom w:w="90" w:type="dxa"/>
+                  <w:right w:w="120" w:type="dxa"/>
+                </w:tcMar>
+                <w:hideMark/>
+              </w:tcPr>
+              <w:p>
+                <w:pPr>
+                  <w:rPr>
+                    <w:rFonts w:eastAsia="Times New Roman"/>
+                  </w:rPr>
+                </w:pPr>
+                <w:r>
+                  <w:rPr>
+                    <w:rFonts w:eastAsia="Times New Roman"/>
+                  </w:rPr>
+                  <w:t>1054</w:t>
+                </w:r>
+              </w:p>
+            </w:tc>
+            <w:tc>
+              <w:tcPr>
+                <w:tcW w:w="0" w:type="auto"/>
+                <w:tcBorders>
+                  <w:top w:val="nil"/>
+                  <w:left w:val="nil"/>
+                  <w:bottom w:val="nil"/>
+                  <w:right w:val="nil"/>
+                </w:tcBorders>
+                <w:tcMar>
+                  <w:top w:w="90" w:type="dxa"/>
+                  <w:left w:w="120" w:type="dxa"/>
+                  <w:bottom w:w="90" w:type="dxa"/>
+                  <w:right w:w="120" w:type="dxa"/>
+                </w:tcMar>
+                <w:hideMark/>
+              </w:tcPr>
+              <w:p>
+                <w:pPr>
+                  <w:rPr>
+                    <w:rFonts w:eastAsia="Times New Roman"/>
+                  </w:rPr>
+                </w:pPr>
+                <w:r>
+                  <w:rPr>
+                    <w:rFonts w:eastAsia="Times New Roman"/>
+                  </w:rPr>
+                  <w:t>165</w:t>
+                </w:r>
+              </w:p>
+            </w:tc>
+          </w:tr>
+        </w:tbl>
+        <w:p/>
+      </w:sdtContent>
+    </w:sdt>
+    <w:sdt>
+      <w:sdtPr>
+        <w:alias w:val="Excel-Variable: Tab2ddd"/>
+        <w:tag w:val="excelvar|Tab2ddd|table|0|0|0|0"/>
+        <w:id w:val="1700280198"/>
+        <w:placeholder>
+          <w:docPart w:val="3CFF41373B3BA24A930878721BE363D5"/>
+        </w:placeholder>
+      </w:sdtPr>
+      <w:sdtContent>
+        <w:p/>
+        <w:tbl>
+          <w:tblPr>
+            <w:tblW w:w="1500" w:type="dxa"/>
             <w:tblCellMar>
               <w:top w:w="15" w:type="dxa"/>
               <w:left w:w="15" w:type="dxa"/>
@@ -650,8 +1050,425 @@
           </w:tblPr>
           <w:tblGrid>
             <w:gridCol w:w="703"/>
-            <w:gridCol w:w="569"/>
-            <w:gridCol w:w="1299"/>
+            <w:gridCol w:w="687"/>
+            <w:gridCol w:w="575"/>
+          </w:tblGrid>
+          <w:tr>
+            <w:tc>
+              <w:tcPr>
+                <w:tcW w:w="0" w:type="auto"/>
+                <w:tcBorders>
+                  <w:top w:val="nil"/>
+                  <w:left w:val="nil"/>
+                  <w:bottom w:val="nil"/>
+                  <w:right w:val="nil"/>
+                </w:tcBorders>
+                <w:tcMar>
+                  <w:top w:w="90" w:type="dxa"/>
+                  <w:left w:w="120" w:type="dxa"/>
+                  <w:bottom w:w="90" w:type="dxa"/>
+                  <w:right w:w="120" w:type="dxa"/>
+                </w:tcMar>
+                <w:hideMark/>
+              </w:tcPr>
+              <w:p>
+                <w:pPr>
+                  <w:rPr>
+                    <w:rFonts w:eastAsia="Times New Roman"/>
+                    <w:sz w:val="24"/>
+                    <w:szCs w:val="24"/>
+                  </w:rPr>
+                </w:pPr>
+                <w:proofErr w:type="spellStart"/>
+                <w:r>
+                  <w:rPr>
+                    <w:rFonts w:eastAsia="Times New Roman"/>
+                  </w:rPr>
+                  <w:t>qqqq</w:t>
+                </w:r>
+                <w:proofErr w:type="spellEnd"/>
+              </w:p>
+            </w:tc>
+            <w:tc>
+              <w:tcPr>
+                <w:tcW w:w="0" w:type="auto"/>
+                <w:tcBorders>
+                  <w:top w:val="nil"/>
+                  <w:left w:val="nil"/>
+                  <w:bottom w:val="nil"/>
+                  <w:right w:val="nil"/>
+                </w:tcBorders>
+                <w:tcMar>
+                  <w:top w:w="90" w:type="dxa"/>
+                  <w:left w:w="120" w:type="dxa"/>
+                  <w:bottom w:w="90" w:type="dxa"/>
+                  <w:right w:w="120" w:type="dxa"/>
+                </w:tcMar>
+                <w:hideMark/>
+              </w:tcPr>
+              <w:p>
+                <w:pPr>
+                  <w:rPr>
+                    <w:rFonts w:eastAsia="Times New Roman"/>
+                  </w:rPr>
+                </w:pPr>
+                <w:proofErr w:type="spellStart"/>
+                <w:r>
+                  <w:rPr>
+                    <w:rFonts w:eastAsia="Times New Roman"/>
+                  </w:rPr>
+                  <w:t>eee</w:t>
+                </w:r>
+                <w:proofErr w:type="spellEnd"/>
+              </w:p>
+            </w:tc>
+            <w:tc>
+              <w:tcPr>
+                <w:tcW w:w="0" w:type="auto"/>
+                <w:tcBorders>
+                  <w:top w:val="nil"/>
+                  <w:left w:val="nil"/>
+                  <w:bottom w:val="nil"/>
+                  <w:right w:val="nil"/>
+                </w:tcBorders>
+                <w:tcMar>
+                  <w:top w:w="90" w:type="dxa"/>
+                  <w:left w:w="120" w:type="dxa"/>
+                  <w:bottom w:w="90" w:type="dxa"/>
+                  <w:right w:w="120" w:type="dxa"/>
+                </w:tcMar>
+                <w:hideMark/>
+              </w:tcPr>
+              <w:p>
+                <w:pPr>
+                  <w:rPr>
+                    <w:rFonts w:eastAsia="Times New Roman"/>
+                  </w:rPr>
+                </w:pPr>
+                <w:r>
+                  <w:rPr>
+                    <w:rFonts w:eastAsia="Times New Roman"/>
+                  </w:rPr>
+                  <w:t>888</w:t>
+                </w:r>
+              </w:p>
+            </w:tc>
+          </w:tr>
+          <w:tr>
+            <w:tc>
+              <w:tcPr>
+                <w:tcW w:w="0" w:type="auto"/>
+                <w:tcBorders>
+                  <w:top w:val="nil"/>
+                  <w:left w:val="nil"/>
+                  <w:bottom w:val="nil"/>
+                  <w:right w:val="nil"/>
+                </w:tcBorders>
+                <w:tcMar>
+                  <w:top w:w="90" w:type="dxa"/>
+                  <w:left w:w="120" w:type="dxa"/>
+                  <w:bottom w:w="90" w:type="dxa"/>
+                  <w:right w:w="120" w:type="dxa"/>
+                </w:tcMar>
+                <w:hideMark/>
+              </w:tcPr>
+              <w:p>
+                <w:pPr>
+                  <w:rPr>
+                    <w:rFonts w:eastAsia="Times New Roman"/>
+                  </w:rPr>
+                </w:pPr>
+                <w:r>
+                  <w:rPr>
+                    <w:rFonts w:eastAsia="Times New Roman"/>
+                  </w:rPr>
+                  <w:t>999</w:t>
+                </w:r>
+              </w:p>
+            </w:tc>
+            <w:tc>
+              <w:tcPr>
+                <w:tcW w:w="0" w:type="auto"/>
+                <w:tcBorders>
+                  <w:top w:val="nil"/>
+                  <w:left w:val="nil"/>
+                  <w:bottom w:val="nil"/>
+                  <w:right w:val="nil"/>
+                </w:tcBorders>
+                <w:tcMar>
+                  <w:top w:w="90" w:type="dxa"/>
+                  <w:left w:w="120" w:type="dxa"/>
+                  <w:bottom w:w="90" w:type="dxa"/>
+                  <w:right w:w="120" w:type="dxa"/>
+                </w:tcMar>
+                <w:hideMark/>
+              </w:tcPr>
+              <w:p>
+                <w:pPr>
+                  <w:rPr>
+                    <w:rFonts w:eastAsia="Times New Roman"/>
+                  </w:rPr>
+                </w:pPr>
+                <w:r>
+                  <w:rPr>
+                    <w:rFonts w:eastAsia="Times New Roman"/>
+                  </w:rPr>
+                  <w:t>999</w:t>
+                </w:r>
+              </w:p>
+            </w:tc>
+            <w:tc>
+              <w:tcPr>
+                <w:tcW w:w="0" w:type="auto"/>
+                <w:tcBorders>
+                  <w:top w:val="nil"/>
+                  <w:left w:val="nil"/>
+                  <w:bottom w:val="nil"/>
+                  <w:right w:val="nil"/>
+                </w:tcBorders>
+                <w:tcMar>
+                  <w:top w:w="90" w:type="dxa"/>
+                  <w:left w:w="120" w:type="dxa"/>
+                  <w:bottom w:w="90" w:type="dxa"/>
+                  <w:right w:w="120" w:type="dxa"/>
+                </w:tcMar>
+                <w:hideMark/>
+              </w:tcPr>
+              <w:p>
+                <w:pPr>
+                  <w:rPr>
+                    <w:rFonts w:eastAsia="Times New Roman"/>
+                  </w:rPr>
+                </w:pPr>
+                <w:r>
+                  <w:rPr>
+                    <w:rFonts w:eastAsia="Times New Roman"/>
+                  </w:rPr>
+                  <w:t>99</w:t>
+                </w:r>
+              </w:p>
+            </w:tc>
+          </w:tr>
+          <w:tr>
+            <w:tc>
+              <w:tcPr>
+                <w:tcW w:w="0" w:type="auto"/>
+                <w:tcBorders>
+                  <w:top w:val="nil"/>
+                  <w:left w:val="nil"/>
+                  <w:bottom w:val="nil"/>
+                  <w:right w:val="nil"/>
+                </w:tcBorders>
+                <w:tcMar>
+                  <w:top w:w="90" w:type="dxa"/>
+                  <w:left w:w="120" w:type="dxa"/>
+                  <w:bottom w:w="90" w:type="dxa"/>
+                  <w:right w:w="120" w:type="dxa"/>
+                </w:tcMar>
+                <w:hideMark/>
+              </w:tcPr>
+              <w:p>
+                <w:pPr>
+                  <w:rPr>
+                    <w:rFonts w:eastAsia="Times New Roman"/>
+                  </w:rPr>
+                </w:pPr>
+                <w:r>
+                  <w:rPr>
+                    <w:rFonts w:eastAsia="Times New Roman"/>
+                  </w:rPr>
+                  <w:t>555</w:t>
+                </w:r>
+              </w:p>
+            </w:tc>
+            <w:tc>
+              <w:tcPr>
+                <w:tcW w:w="0" w:type="auto"/>
+                <w:tcBorders>
+                  <w:top w:val="nil"/>
+                  <w:left w:val="nil"/>
+                  <w:bottom w:val="nil"/>
+                  <w:right w:val="nil"/>
+                </w:tcBorders>
+                <w:tcMar>
+                  <w:top w:w="90" w:type="dxa"/>
+                  <w:left w:w="120" w:type="dxa"/>
+                  <w:bottom w:w="90" w:type="dxa"/>
+                  <w:right w:w="120" w:type="dxa"/>
+                </w:tcMar>
+                <w:hideMark/>
+              </w:tcPr>
+              <w:p>
+                <w:pPr>
+                  <w:rPr>
+                    <w:rFonts w:eastAsia="Times New Roman"/>
+                  </w:rPr>
+                </w:pPr>
+                <w:r>
+                  <w:rPr>
+                    <w:rFonts w:eastAsia="Times New Roman"/>
+                  </w:rPr>
+                  <w:t>55</w:t>
+                </w:r>
+              </w:p>
+            </w:tc>
+            <w:tc>
+              <w:tcPr>
+                <w:tcW w:w="0" w:type="auto"/>
+                <w:tcBorders>
+                  <w:top w:val="nil"/>
+                  <w:left w:val="nil"/>
+                  <w:bottom w:val="nil"/>
+                  <w:right w:val="nil"/>
+                </w:tcBorders>
+                <w:tcMar>
+                  <w:top w:w="90" w:type="dxa"/>
+                  <w:left w:w="120" w:type="dxa"/>
+                  <w:bottom w:w="90" w:type="dxa"/>
+                  <w:right w:w="120" w:type="dxa"/>
+                </w:tcMar>
+                <w:hideMark/>
+              </w:tcPr>
+              <w:p>
+                <w:pPr>
+                  <w:rPr>
+                    <w:rFonts w:eastAsia="Times New Roman"/>
+                  </w:rPr>
+                </w:pPr>
+                <w:r>
+                  <w:rPr>
+                    <w:rFonts w:eastAsia="Times New Roman"/>
+                  </w:rPr>
+                  <w:t>66</w:t>
+                </w:r>
+              </w:p>
+            </w:tc>
+          </w:tr>
+          <w:tr>
+            <w:tc>
+              <w:tcPr>
+                <w:tcW w:w="0" w:type="auto"/>
+                <w:tcBorders>
+                  <w:top w:val="nil"/>
+                  <w:left w:val="nil"/>
+                  <w:bottom w:val="nil"/>
+                  <w:right w:val="nil"/>
+                </w:tcBorders>
+                <w:tcMar>
+                  <w:top w:w="90" w:type="dxa"/>
+                  <w:left w:w="120" w:type="dxa"/>
+                  <w:bottom w:w="90" w:type="dxa"/>
+                  <w:right w:w="120" w:type="dxa"/>
+                </w:tcMar>
+                <w:hideMark/>
+              </w:tcPr>
+              <w:p>
+                <w:pPr>
+                  <w:rPr>
+                    <w:rFonts w:eastAsia="Times New Roman"/>
+                  </w:rPr>
+                </w:pPr>
+                <w:r>
+                  <w:rPr>
+                    <w:rFonts w:eastAsia="Times New Roman"/>
+                  </w:rPr>
+                  <w:t>1554</w:t>
+                </w:r>
+              </w:p>
+            </w:tc>
+            <w:tc>
+              <w:tcPr>
+                <w:tcW w:w="0" w:type="auto"/>
+                <w:tcBorders>
+                  <w:top w:val="nil"/>
+                  <w:left w:val="nil"/>
+                  <w:bottom w:val="nil"/>
+                  <w:right w:val="nil"/>
+                </w:tcBorders>
+                <w:tcMar>
+                  <w:top w:w="90" w:type="dxa"/>
+                  <w:left w:w="120" w:type="dxa"/>
+                  <w:bottom w:w="90" w:type="dxa"/>
+                  <w:right w:w="120" w:type="dxa"/>
+                </w:tcMar>
+                <w:hideMark/>
+              </w:tcPr>
+              <w:p>
+                <w:pPr>
+                  <w:rPr>
+                    <w:rFonts w:eastAsia="Times New Roman"/>
+                  </w:rPr>
+                </w:pPr>
+                <w:r>
+                  <w:rPr>
+                    <w:rFonts w:eastAsia="Times New Roman"/>
+                  </w:rPr>
+                  <w:t>1054</w:t>
+                </w:r>
+              </w:p>
+            </w:tc>
+            <w:tc>
+              <w:tcPr>
+                <w:tcW w:w="0" w:type="auto"/>
+                <w:tcBorders>
+                  <w:top w:val="nil"/>
+                  <w:left w:val="nil"/>
+                  <w:bottom w:val="nil"/>
+                  <w:right w:val="nil"/>
+                </w:tcBorders>
+                <w:tcMar>
+                  <w:top w:w="90" w:type="dxa"/>
+                  <w:left w:w="120" w:type="dxa"/>
+                  <w:bottom w:w="90" w:type="dxa"/>
+                  <w:right w:w="120" w:type="dxa"/>
+                </w:tcMar>
+                <w:hideMark/>
+              </w:tcPr>
+              <w:p>
+                <w:pPr>
+                  <w:rPr>
+                    <w:rFonts w:eastAsia="Times New Roman"/>
+                  </w:rPr>
+                </w:pPr>
+                <w:r>
+                  <w:rPr>
+                    <w:rFonts w:eastAsia="Times New Roman"/>
+                  </w:rPr>
+                  <w:t>165</w:t>
+                </w:r>
+              </w:p>
+            </w:tc>
+          </w:tr>
+        </w:tbl>
+        <w:p/>
+      </w:sdtContent>
+    </w:sdt>
+    <w:sdt>
+      <w:sdtPr>
+        <w:alias w:val="Excel-Variable: Tab2ddd"/>
+        <w:tag w:val="excelvar|Tab2ddd|table|0|1|0|0"/>
+        <w:id w:val="2088578463"/>
+        <w:placeholder>
+          <w:docPart w:val="EDFBA784379E15439424CF1F7629C486"/>
+        </w:placeholder>
+      </w:sdtPr>
+      <w:sdtContent>
+        <w:p/>
+        <w:tbl>
+          <w:tblPr>
+            <w:tblW w:w="1500" w:type="dxa"/>
+            <w:tblCellMar>
+              <w:top w:w="15" w:type="dxa"/>
+              <w:left w:w="15" w:type="dxa"/>
+              <w:bottom w:w="15" w:type="dxa"/>
+              <w:right w:w="15" w:type="dxa"/>
+            </w:tblCellMar>
+            <w:tblLook w:val="04A0" w:firstRow="1" w:lastRow="0" w:firstColumn="1" w:lastColumn="0" w:noHBand="0" w:noVBand="1"/>
+          </w:tblPr>
+          <w:tblGrid>
+            <w:gridCol w:w="703"/>
+            <w:gridCol w:w="687"/>
+            <w:gridCol w:w="575"/>
           </w:tblGrid>
           <w:tr>
             <w:tc>
@@ -674,14 +1491,17 @@
               <w:p>
                 <w:pPr>
                   <w:rPr>
-                    <w:rFonts w:ascii="Calibri" w:eastAsia="Times New Roman" w:hAnsi="Calibri" w:cs="Calibri"/>
+                    <w:rFonts w:eastAsia="Times New Roman"/>
+                    <w:sz w:val="24"/>
+                    <w:szCs w:val="24"/>
                   </w:rPr>
                 </w:pPr>
                 <w:proofErr w:type="spellStart"/>
                 <w:r>
                   <w:rPr>
-                    <w:rFonts w:ascii="Calibri" w:eastAsia="Times New Roman" w:hAnsi="Calibri" w:cs="Calibri"/>
-                  </w:rPr>
+                    <w:rFonts w:eastAsia="Times New Roman"/>
+                  </w:rPr>
+                  <w:lastRenderedPageBreak/>
                   <w:t>qqqq</w:t>
                 </w:r>
                 <w:proofErr w:type="spellEnd"/>
@@ -707,13 +1527,13 @@
               <w:p>
                 <w:pPr>
                   <w:rPr>
-                    <w:rFonts w:ascii="Calibri" w:eastAsia="Times New Roman" w:hAnsi="Calibri" w:cs="Calibri"/>
+                    <w:rFonts w:eastAsia="Times New Roman"/>
                   </w:rPr>
                 </w:pPr>
                 <w:proofErr w:type="spellStart"/>
                 <w:r>
                   <w:rPr>
-                    <w:rFonts w:ascii="Calibri" w:eastAsia="Times New Roman" w:hAnsi="Calibri" w:cs="Calibri"/>
+                    <w:rFonts w:eastAsia="Times New Roman"/>
                   </w:rPr>
                   <w:t>eee</w:t>
                 </w:r>
@@ -740,139 +1560,14 @@
               <w:p>
                 <w:pPr>
                   <w:rPr>
-                    <w:rFonts w:ascii="Calibri" w:eastAsia="Times New Roman" w:hAnsi="Calibri" w:cs="Calibri"/>
-                  </w:rPr>
-                </w:pPr>
-                <w:proofErr w:type="spellStart"/>
-                <w:r>
-                  <w:rPr>
-                    <w:rFonts w:ascii="Calibri" w:eastAsia="Times New Roman" w:hAnsi="Calibri" w:cs="Calibri"/>
-                  </w:rPr>
-                  <w:t>rrr</w:t>
-                </w:r>
-                <w:proofErr w:type="spellEnd"/>
-                <w:r>
-                  <w:rPr>
-                    <w:rFonts w:ascii="Calibri" w:eastAsia="Times New Roman" w:hAnsi="Calibri" w:cs="Calibri"/>
-                  </w:rPr>
-                  <w:t xml:space="preserve"> </w:t>
-                </w:r>
-                <w:proofErr w:type="spellStart"/>
-                <w:r>
-                  <w:rPr>
-                    <w:rFonts w:ascii="Calibri" w:eastAsia="Times New Roman" w:hAnsi="Calibri" w:cs="Calibri"/>
-                  </w:rPr>
-                  <w:t>tttt</w:t>
-                </w:r>
-                <w:proofErr w:type="spellEnd"/>
-                <w:r>
-                  <w:rPr>
-                    <w:rFonts w:ascii="Calibri" w:eastAsia="Times New Roman" w:hAnsi="Calibri" w:cs="Calibri"/>
-                  </w:rPr>
-                  <w:t xml:space="preserve"> </w:t>
-                </w:r>
-                <w:proofErr w:type="spellStart"/>
-                <w:r>
-                  <w:rPr>
-                    <w:rFonts w:ascii="Calibri" w:eastAsia="Times New Roman" w:hAnsi="Calibri" w:cs="Calibri"/>
-                  </w:rPr>
-                  <w:t>zzzzz</w:t>
-                </w:r>
-                <w:proofErr w:type="spellEnd"/>
-              </w:p>
-            </w:tc>
-          </w:tr>
-          <w:tr>
-            <w:tc>
-              <w:tcPr>
-                <w:tcW w:w="0" w:type="auto"/>
-                <w:tcBorders>
-                  <w:top w:val="single" w:sz="6" w:space="0" w:color="666666"/>
-                  <w:left w:val="single" w:sz="6" w:space="0" w:color="666666"/>
-                  <w:bottom w:val="single" w:sz="6" w:space="0" w:color="666666"/>
-                  <w:right w:val="single" w:sz="6" w:space="0" w:color="666666"/>
-                </w:tcBorders>
-                <w:tcMar>
-                  <w:top w:w="90" w:type="dxa"/>
-                  <w:left w:w="120" w:type="dxa"/>
-                  <w:bottom w:w="90" w:type="dxa"/>
-                  <w:right w:w="120" w:type="dxa"/>
-                </w:tcMar>
-                <w:hideMark/>
-              </w:tcPr>
-              <w:p>
-                <w:pPr>
-                  <w:rPr>
-                    <w:rFonts w:ascii="Calibri" w:eastAsia="Times New Roman" w:hAnsi="Calibri" w:cs="Calibri"/>
+                    <w:rFonts w:eastAsia="Times New Roman"/>
                   </w:rPr>
                 </w:pPr>
                 <w:r>
                   <w:rPr>
-                    <w:rFonts w:ascii="Calibri" w:eastAsia="Times New Roman" w:hAnsi="Calibri" w:cs="Calibri"/>
-                  </w:rPr>
-                  <w:t>55</w:t>
-                </w:r>
-              </w:p>
-            </w:tc>
-            <w:tc>
-              <w:tcPr>
-                <w:tcW w:w="0" w:type="auto"/>
-                <w:tcBorders>
-                  <w:top w:val="single" w:sz="6" w:space="0" w:color="666666"/>
-                  <w:left w:val="single" w:sz="6" w:space="0" w:color="666666"/>
-                  <w:bottom w:val="single" w:sz="6" w:space="0" w:color="666666"/>
-                  <w:right w:val="single" w:sz="6" w:space="0" w:color="666666"/>
-                </w:tcBorders>
-                <w:tcMar>
-                  <w:top w:w="90" w:type="dxa"/>
-                  <w:left w:w="120" w:type="dxa"/>
-                  <w:bottom w:w="90" w:type="dxa"/>
-                  <w:right w:w="120" w:type="dxa"/>
-                </w:tcMar>
-                <w:hideMark/>
-              </w:tcPr>
-              <w:p>
-                <w:pPr>
-                  <w:rPr>
-                    <w:rFonts w:ascii="Calibri" w:eastAsia="Times New Roman" w:hAnsi="Calibri" w:cs="Calibri"/>
-                  </w:rPr>
-                </w:pPr>
-                <w:r>
-                  <w:rPr>
-                    <w:rFonts w:ascii="Calibri" w:eastAsia="Times New Roman" w:hAnsi="Calibri" w:cs="Calibri"/>
-                  </w:rPr>
-                  <w:t>5</w:t>
-                </w:r>
-              </w:p>
-            </w:tc>
-            <w:tc>
-              <w:tcPr>
-                <w:tcW w:w="0" w:type="auto"/>
-                <w:tcBorders>
-                  <w:top w:val="single" w:sz="6" w:space="0" w:color="666666"/>
-                  <w:left w:val="single" w:sz="6" w:space="0" w:color="666666"/>
-                  <w:bottom w:val="single" w:sz="6" w:space="0" w:color="666666"/>
-                  <w:right w:val="single" w:sz="6" w:space="0" w:color="666666"/>
-                </w:tcBorders>
-                <w:tcMar>
-                  <w:top w:w="90" w:type="dxa"/>
-                  <w:left w:w="120" w:type="dxa"/>
-                  <w:bottom w:w="90" w:type="dxa"/>
-                  <w:right w:w="120" w:type="dxa"/>
-                </w:tcMar>
-                <w:hideMark/>
-              </w:tcPr>
-              <w:p>
-                <w:pPr>
-                  <w:rPr>
-                    <w:rFonts w:ascii="Calibri" w:eastAsia="Times New Roman" w:hAnsi="Calibri" w:cs="Calibri"/>
-                  </w:rPr>
-                </w:pPr>
-                <w:r>
-                  <w:rPr>
-                    <w:rFonts w:ascii="Calibri" w:eastAsia="Times New Roman" w:hAnsi="Calibri" w:cs="Calibri"/>
-                  </w:rPr>
-                  <w:t>33</w:t>
+                    <w:rFonts w:eastAsia="Times New Roman"/>
+                  </w:rPr>
+                  <w:t>888</w:t>
                 </w:r>
               </w:p>
             </w:tc>
@@ -898,12 +1593,107 @@
               <w:p>
                 <w:pPr>
                   <w:rPr>
-                    <w:rFonts w:ascii="Calibri" w:eastAsia="Times New Roman" w:hAnsi="Calibri" w:cs="Calibri"/>
+                    <w:rFonts w:eastAsia="Times New Roman"/>
                   </w:rPr>
                 </w:pPr>
                 <w:r>
                   <w:rPr>
-                    <w:rFonts w:ascii="Calibri" w:eastAsia="Times New Roman" w:hAnsi="Calibri" w:cs="Calibri"/>
+                    <w:rFonts w:eastAsia="Times New Roman"/>
+                  </w:rPr>
+                  <w:t>999</w:t>
+                </w:r>
+              </w:p>
+            </w:tc>
+            <w:tc>
+              <w:tcPr>
+                <w:tcW w:w="0" w:type="auto"/>
+                <w:tcBorders>
+                  <w:top w:val="single" w:sz="6" w:space="0" w:color="666666"/>
+                  <w:left w:val="single" w:sz="6" w:space="0" w:color="666666"/>
+                  <w:bottom w:val="single" w:sz="6" w:space="0" w:color="666666"/>
+                  <w:right w:val="single" w:sz="6" w:space="0" w:color="666666"/>
+                </w:tcBorders>
+                <w:tcMar>
+                  <w:top w:w="90" w:type="dxa"/>
+                  <w:left w:w="120" w:type="dxa"/>
+                  <w:bottom w:w="90" w:type="dxa"/>
+                  <w:right w:w="120" w:type="dxa"/>
+                </w:tcMar>
+                <w:hideMark/>
+              </w:tcPr>
+              <w:p>
+                <w:pPr>
+                  <w:rPr>
+                    <w:rFonts w:eastAsia="Times New Roman"/>
+                  </w:rPr>
+                </w:pPr>
+                <w:r>
+                  <w:rPr>
+                    <w:rFonts w:eastAsia="Times New Roman"/>
+                  </w:rPr>
+                  <w:t>999</w:t>
+                </w:r>
+              </w:p>
+            </w:tc>
+            <w:tc>
+              <w:tcPr>
+                <w:tcW w:w="0" w:type="auto"/>
+                <w:tcBorders>
+                  <w:top w:val="single" w:sz="6" w:space="0" w:color="666666"/>
+                  <w:left w:val="single" w:sz="6" w:space="0" w:color="666666"/>
+                  <w:bottom w:val="single" w:sz="6" w:space="0" w:color="666666"/>
+                  <w:right w:val="single" w:sz="6" w:space="0" w:color="666666"/>
+                </w:tcBorders>
+                <w:tcMar>
+                  <w:top w:w="90" w:type="dxa"/>
+                  <w:left w:w="120" w:type="dxa"/>
+                  <w:bottom w:w="90" w:type="dxa"/>
+                  <w:right w:w="120" w:type="dxa"/>
+                </w:tcMar>
+                <w:hideMark/>
+              </w:tcPr>
+              <w:p>
+                <w:pPr>
+                  <w:rPr>
+                    <w:rFonts w:eastAsia="Times New Roman"/>
+                  </w:rPr>
+                </w:pPr>
+                <w:r>
+                  <w:rPr>
+                    <w:rFonts w:eastAsia="Times New Roman"/>
+                  </w:rPr>
+                  <w:t>99</w:t>
+                </w:r>
+              </w:p>
+            </w:tc>
+          </w:tr>
+          <w:tr>
+            <w:tc>
+              <w:tcPr>
+                <w:tcW w:w="0" w:type="auto"/>
+                <w:tcBorders>
+                  <w:top w:val="single" w:sz="6" w:space="0" w:color="666666"/>
+                  <w:left w:val="single" w:sz="6" w:space="0" w:color="666666"/>
+                  <w:bottom w:val="single" w:sz="6" w:space="0" w:color="666666"/>
+                  <w:right w:val="single" w:sz="6" w:space="0" w:color="666666"/>
+                </w:tcBorders>
+                <w:tcMar>
+                  <w:top w:w="90" w:type="dxa"/>
+                  <w:left w:w="120" w:type="dxa"/>
+                  <w:bottom w:w="90" w:type="dxa"/>
+                  <w:right w:w="120" w:type="dxa"/>
+                </w:tcMar>
+                <w:hideMark/>
+              </w:tcPr>
+              <w:p>
+                <w:pPr>
+                  <w:rPr>
+                    <w:rFonts w:eastAsia="Times New Roman"/>
+                  </w:rPr>
+                </w:pPr>
+                <w:r>
+                  <w:rPr>
+                    <w:rFonts w:eastAsia="Times New Roman"/>
                   </w:rPr>
                   <w:t>555</w:t>
                 </w:r>
@@ -929,12 +1719,12 @@
               <w:p>
                 <w:pPr>
                   <w:rPr>
-                    <w:rFonts w:ascii="Calibri" w:eastAsia="Times New Roman" w:hAnsi="Calibri" w:cs="Calibri"/>
+                    <w:rFonts w:eastAsia="Times New Roman"/>
                   </w:rPr>
                 </w:pPr>
                 <w:r>
                   <w:rPr>
-                    <w:rFonts w:ascii="Calibri" w:eastAsia="Times New Roman" w:hAnsi="Calibri" w:cs="Calibri"/>
+                    <w:rFonts w:eastAsia="Times New Roman"/>
                   </w:rPr>
                   <w:t>55</w:t>
                 </w:r>
@@ -960,12 +1750,12 @@
               <w:p>
                 <w:pPr>
                   <w:rPr>
-                    <w:rFonts w:ascii="Calibri" w:eastAsia="Times New Roman" w:hAnsi="Calibri" w:cs="Calibri"/>
+                    <w:rFonts w:eastAsia="Times New Roman"/>
                   </w:rPr>
                 </w:pPr>
                 <w:r>
                   <w:rPr>
-                    <w:rFonts w:ascii="Calibri" w:eastAsia="Times New Roman" w:hAnsi="Calibri" w:cs="Calibri"/>
+                    <w:rFonts w:eastAsia="Times New Roman"/>
                   </w:rPr>
                   <w:t>66</w:t>
                 </w:r>
@@ -993,14 +1783,14 @@
               <w:p>
                 <w:pPr>
                   <w:rPr>
-                    <w:rFonts w:ascii="Calibri" w:eastAsia="Times New Roman" w:hAnsi="Calibri" w:cs="Calibri"/>
+                    <w:rFonts w:eastAsia="Times New Roman"/>
                   </w:rPr>
                 </w:pPr>
                 <w:r>
                   <w:rPr>
-                    <w:rFonts w:ascii="Calibri" w:eastAsia="Times New Roman" w:hAnsi="Calibri" w:cs="Calibri"/>
-                  </w:rPr>
-                  <w:t>610</w:t>
+                    <w:rFonts w:eastAsia="Times New Roman"/>
+                  </w:rPr>
+                  <w:t>1554</w:t>
                 </w:r>
               </w:p>
             </w:tc>
@@ -1024,14 +1814,14 @@
               <w:p>
                 <w:pPr>
                   <w:rPr>
-                    <w:rFonts w:ascii="Calibri" w:eastAsia="Times New Roman" w:hAnsi="Calibri" w:cs="Calibri"/>
+                    <w:rFonts w:eastAsia="Times New Roman"/>
                   </w:rPr>
                 </w:pPr>
                 <w:r>
                   <w:rPr>
-                    <w:rFonts w:ascii="Calibri" w:eastAsia="Times New Roman" w:hAnsi="Calibri" w:cs="Calibri"/>
-                  </w:rPr>
-                  <w:t>60</w:t>
+                    <w:rFonts w:eastAsia="Times New Roman"/>
+                  </w:rPr>
+                  <w:t>1054</w:t>
                 </w:r>
               </w:p>
             </w:tc>
@@ -1055,201 +1845,20 @@
               <w:p>
                 <w:pPr>
                   <w:rPr>
-                    <w:rFonts w:ascii="Calibri" w:eastAsia="Times New Roman" w:hAnsi="Calibri" w:cs="Calibri"/>
+                    <w:rFonts w:eastAsia="Times New Roman"/>
                   </w:rPr>
                 </w:pPr>
                 <w:r>
                   <w:rPr>
-                    <w:rFonts w:ascii="Calibri" w:eastAsia="Times New Roman" w:hAnsi="Calibri" w:cs="Calibri"/>
-                  </w:rPr>
-                  <w:t>99</w:t>
+                    <w:rFonts w:eastAsia="Times New Roman"/>
+                  </w:rPr>
+                  <w:t>165</w:t>
                 </w:r>
               </w:p>
             </w:tc>
           </w:tr>
         </w:tbl>
-        <w:p>
-          <w:pPr>
-            <w:rPr>
-              <w:highlight w:val="yellow"/>
-            </w:rPr>
-          </w:pPr>
-        </w:p>
-      </w:sdtContent>
-    </w:sdt>
-    <w:sdt>
-      <w:sdtPr>
-        <w:rPr>
-          <w:highlight w:val="yellow"/>
-        </w:rPr>
-        <w:alias w:val="Excel-Variable: Tabelle1"/>
-        <w:tag w:val="excelvar|Tabelle1|table|1|1|1|0"/>
-        <w:id w:val="2087261957"/>
-        <w:placeholder>
-          <w:docPart w:val="C49038E838854B4BA3C93E2A39FA9F6E"/>
-        </w:placeholder>
-      </w:sdtPr>
-      <w:sdtContent>
-        <w:p>
-          <w:pPr>
-            <w:rPr>
-              <w:highlight w:val="yellow"/>
-            </w:rPr>
-          </w:pPr>
-        </w:p>
-        <w:tbl>
-          <w:tblPr>
-            <w:tblW w:w="5000" w:type="pct"/>
-            <w:tblCellMar>
-              <w:top w:w="15" w:type="dxa"/>
-              <w:left w:w="15" w:type="dxa"/>
-              <w:bottom w:w="15" w:type="dxa"/>
-              <w:right w:w="15" w:type="dxa"/>
-            </w:tblCellMar>
-            <w:tblLook w:val="04A0" w:firstRow="1" w:lastRow="0" w:firstColumn="1" w:lastColumn="0" w:noHBand="0" w:noVBand="1"/>
-          </w:tblPr>
-          <w:tblGrid>
-            <w:gridCol w:w="4104"/>
-            <w:gridCol w:w="5240"/>
-          </w:tblGrid>
-          <w:tr>
-            <w:tc>
-              <w:tcPr>
-                <w:tcW w:w="2196" w:type="pct"/>
-                <w:tcBorders>
-                  <w:top w:val="single" w:sz="6" w:space="0" w:color="666666"/>
-                  <w:left w:val="single" w:sz="6" w:space="0" w:color="666666"/>
-                  <w:bottom w:val="single" w:sz="6" w:space="0" w:color="666666"/>
-                  <w:right w:val="single" w:sz="6" w:space="0" w:color="666666"/>
-                </w:tcBorders>
-                <w:tcMar>
-                  <w:top w:w="90" w:type="dxa"/>
-                  <w:left w:w="120" w:type="dxa"/>
-                  <w:bottom w:w="90" w:type="dxa"/>
-                  <w:right w:w="120" w:type="dxa"/>
-                </w:tcMar>
-                <w:hideMark/>
-              </w:tcPr>
-              <w:p>
-                <w:pPr>
-                  <w:rPr>
-                    <w:rFonts w:eastAsia="Times New Roman"/>
-                    <w:sz w:val="24"/>
-                    <w:szCs w:val="24"/>
-                  </w:rPr>
-                </w:pPr>
-                <w:r>
-                  <w:rPr>
-                    <w:rFonts w:eastAsia="Times New Roman"/>
-                  </w:rPr>
-                  <w:t>1111</w:t>
-                </w:r>
-              </w:p>
-            </w:tc>
-            <w:tc>
-              <w:tcPr>
-                <w:tcW w:w="2804" w:type="pct"/>
-                <w:tcBorders>
-                  <w:top w:val="single" w:sz="6" w:space="0" w:color="666666"/>
-                  <w:left w:val="single" w:sz="6" w:space="0" w:color="666666"/>
-                  <w:bottom w:val="single" w:sz="6" w:space="0" w:color="666666"/>
-                  <w:right w:val="single" w:sz="6" w:space="0" w:color="666666"/>
-                </w:tcBorders>
-                <w:tcMar>
-                  <w:top w:w="90" w:type="dxa"/>
-                  <w:left w:w="120" w:type="dxa"/>
-                  <w:bottom w:w="90" w:type="dxa"/>
-                  <w:right w:w="120" w:type="dxa"/>
-                </w:tcMar>
-                <w:hideMark/>
-              </w:tcPr>
-              <w:p>
-                <w:pPr>
-                  <w:rPr>
-                    <w:rFonts w:eastAsia="Times New Roman"/>
-                  </w:rPr>
-                </w:pPr>
-                <w:r>
-                  <w:rPr>
-                    <w:rFonts w:eastAsia="Times New Roman"/>
-                  </w:rPr>
-                  <w:t>dd</w:t>
-                </w:r>
-              </w:p>
-            </w:tc>
-          </w:tr>
-          <w:tr>
-            <w:tc>
-              <w:tcPr>
-                <w:tcW w:w="2196" w:type="pct"/>
-                <w:tcBorders>
-                  <w:top w:val="single" w:sz="6" w:space="0" w:color="666666"/>
-                  <w:left w:val="single" w:sz="6" w:space="0" w:color="666666"/>
-                  <w:bottom w:val="single" w:sz="6" w:space="0" w:color="666666"/>
-                  <w:right w:val="single" w:sz="6" w:space="0" w:color="666666"/>
-                </w:tcBorders>
-                <w:tcMar>
-                  <w:top w:w="90" w:type="dxa"/>
-                  <w:left w:w="120" w:type="dxa"/>
-                  <w:bottom w:w="90" w:type="dxa"/>
-                  <w:right w:w="120" w:type="dxa"/>
-                </w:tcMar>
-                <w:hideMark/>
-              </w:tcPr>
-              <w:p>
-                <w:pPr>
-                  <w:rPr>
-                    <w:rFonts w:eastAsia="Times New Roman"/>
-                  </w:rPr>
-                </w:pPr>
-                <w:r>
-                  <w:rPr>
-                    <w:rFonts w:eastAsia="Times New Roman"/>
-                  </w:rPr>
-                  <w:t>bb</w:t>
-                </w:r>
-              </w:p>
-            </w:tc>
-            <w:tc>
-              <w:tcPr>
-                <w:tcW w:w="2804" w:type="pct"/>
-                <w:tcBorders>
-                  <w:top w:val="single" w:sz="6" w:space="0" w:color="666666"/>
-                  <w:left w:val="single" w:sz="6" w:space="0" w:color="666666"/>
-                  <w:bottom w:val="single" w:sz="6" w:space="0" w:color="666666"/>
-                  <w:right w:val="single" w:sz="6" w:space="0" w:color="666666"/>
-                </w:tcBorders>
-                <w:tcMar>
-                  <w:top w:w="90" w:type="dxa"/>
-                  <w:left w:w="120" w:type="dxa"/>
-                  <w:bottom w:w="90" w:type="dxa"/>
-                  <w:right w:w="120" w:type="dxa"/>
-                </w:tcMar>
-                <w:hideMark/>
-              </w:tcPr>
-              <w:p>
-                <w:pPr>
-                  <w:rPr>
-                    <w:rFonts w:eastAsia="Times New Roman"/>
-                  </w:rPr>
-                </w:pPr>
-                <w:r>
-                  <w:rPr>
-                    <w:rFonts w:eastAsia="Times New Roman"/>
-                  </w:rPr>
-                  <w:t>22</w:t>
-                </w:r>
-              </w:p>
-            </w:tc>
-          </w:tr>
-        </w:tbl>
-        <w:p>
-          <w:pPr>
-            <w:rPr>
-              <w:highlight w:val="yellow"/>
-            </w:rPr>
-          </w:pPr>
-        </w:p>
+        <w:p/>
       </w:sdtContent>
     </w:sdt>
     <w:sectPr>
@@ -2199,7 +2808,7 @@
     </w:docPart>
     <w:docPart>
       <w:docPartPr>
-        <w:name w:val="7E95AFE77384054ABF1F1BC7F3FCB308"/>
+        <w:name w:val="3CFF41373B3BA24A930878721BE363D5"/>
         <w:category>
           <w:name w:val="Allgemein"/>
           <w:gallery w:val="placeholder"/>
@@ -2210,7 +2819,7 @@
         <w:behaviors>
           <w:behavior w:val="content"/>
         </w:behaviors>
-        <w:guid w:val="{33D59DC5-4232-884D-BC05-410B904C67E1}"/>
+        <w:guid w:val="{07437578-6E9B-8A4D-BB66-9FC1F789CB98}"/>
       </w:docPartPr>
       <w:docPartBody>
         <w:p/>
@@ -2218,7 +2827,7 @@
     </w:docPart>
     <w:docPart>
       <w:docPartPr>
-        <w:name w:val="C49038E838854B4BA3C93E2A39FA9F6E"/>
+        <w:name w:val="EDFBA784379E15439424CF1F7629C486"/>
         <w:category>
           <w:name w:val="Allgemein"/>
           <w:gallery w:val="placeholder"/>
@@ -2229,7 +2838,26 @@
         <w:behaviors>
           <w:behavior w:val="content"/>
         </w:behaviors>
-        <w:guid w:val="{16985DF4-A13A-224D-9F0A-E4962C7A1A1B}"/>
+        <w:guid w:val="{A3E8A5CA-B31A-484F-A0BA-B01EF8853DF8}"/>
+      </w:docPartPr>
+      <w:docPartBody>
+        <w:p/>
+      </w:docPartBody>
+    </w:docPart>
+    <w:docPart>
+      <w:docPartPr>
+        <w:name w:val="94DB373E7B66344B8F71333A221AE188"/>
+        <w:category>
+          <w:name w:val="Allgemein"/>
+          <w:gallery w:val="placeholder"/>
+        </w:category>
+        <w:types>
+          <w:type w:val="bbPlcHdr"/>
+        </w:types>
+        <w:behaviors>
+          <w:behavior w:val="content"/>
+        </w:behaviors>
+        <w:guid w:val="{B35D45D9-B2C2-5949-940A-527088C15ABF}"/>
       </w:docPartPr>
       <w:docPartBody>
         <w:p/>
@@ -2317,14 +2945,16 @@
   </w:compat>
   <w:rsids>
     <w:rsidRoot w:val="00A31B1C"/>
+    <w:rsid w:val="00127DAE"/>
     <w:rsid w:val="001E12FB"/>
     <w:rsid w:val="004B2D31"/>
     <w:rsid w:val="00745CF0"/>
-    <w:rsid w:val="00782463"/>
     <w:rsid w:val="0079490A"/>
+    <w:rsid w:val="008C28AC"/>
     <w:rsid w:val="009310BB"/>
     <w:rsid w:val="00A31B1C"/>
     <w:rsid w:val="00C156AE"/>
+    <w:rsid w:val="00E41625"/>
   </w:rsids>
   <m:mathPr>
     <m:mathFont m:val="Cambria Math"/>
@@ -3075,7 +3705,7 @@
   <we:reference id="cbe4f1c1-6a07-46b7-8453-ffc1395413c3" version="1.0.0.0" store="developer" storeType="Registry"/>
   <we:alternateReferences/>
   <we:properties>
-    <we:property name="excelWordLinkedFileMeta" value="{&quot;fileName&quot;:&quot;ExcelTestDatei1.xlsx&quot;,&quot;lastLoadedAt&quot;:&quot;3.4.2026, 18:55:45&quot;}"/>
+    <we:property name="excelWordLinkedFileMeta" value="{&quot;fileName&quot;:&quot;ExcelTestDatei1.xlsx&quot;,&quot;lastLoadedAt&quot;:&quot;3.4.2026, 19:22:18&quot;}"/>
   </we:properties>
   <we:bindings/>
   <we:snapshot xmlns:r="http://schemas.openxmlformats.org/officeDocument/2006/relationships"/>

</xml_diff>